<commit_message>
nmmv 27 06 2026
</commit_message>
<xml_diff>
--- a/brAhmaNa/TB 3.7-3.12 Malayalam Corrections.docx
+++ b/brAhmaNa/TB 3.7-3.12 Malayalam Corrections.docx
@@ -1538,6 +1538,99 @@
                 <w:szCs w:val="28"/>
               </w:rPr>
             </w:pPr>
+            <w:r>
+              <w:rPr>
+                <w:b/>
+                <w:sz w:val="28"/>
+                <w:szCs w:val="28"/>
+              </w:rPr>
+              <w:t>T.B.3.</w:t>
+            </w:r>
+            <w:r>
+              <w:rPr>
+                <w:b/>
+                <w:sz w:val="28"/>
+                <w:szCs w:val="28"/>
+              </w:rPr>
+              <w:t>11.</w:t>
+            </w:r>
+            <w:r>
+              <w:rPr>
+                <w:b/>
+                <w:sz w:val="28"/>
+                <w:szCs w:val="28"/>
+              </w:rPr>
+              <w:t>1.</w:t>
+            </w:r>
+            <w:r>
+              <w:rPr>
+                <w:b/>
+                <w:sz w:val="28"/>
+                <w:szCs w:val="28"/>
+              </w:rPr>
+              <w:t>3</w:t>
+            </w:r>
+          </w:p>
+          <w:p>
+            <w:pPr>
+              <w:spacing w:before="0" w:line="240" w:lineRule="auto"/>
+              <w:jc w:val="both"/>
+              <w:rPr>
+                <w:b/>
+                <w:sz w:val="28"/>
+                <w:szCs w:val="28"/>
+              </w:rPr>
+            </w:pPr>
+            <w:r>
+              <w:rPr>
+                <w:b/>
+                <w:sz w:val="28"/>
+                <w:szCs w:val="28"/>
+              </w:rPr>
+              <w:t>Statement No.</w:t>
+            </w:r>
+            <w:r>
+              <w:rPr>
+                <w:b/>
+                <w:sz w:val="28"/>
+                <w:szCs w:val="28"/>
+              </w:rPr>
+              <w:t xml:space="preserve"> – </w:t>
+            </w:r>
+            <w:r>
+              <w:rPr>
+                <w:b/>
+                <w:sz w:val="28"/>
+                <w:szCs w:val="28"/>
+              </w:rPr>
+              <w:t>6</w:t>
+            </w:r>
+          </w:p>
+          <w:p>
+            <w:pPr>
+              <w:spacing w:before="0" w:line="240" w:lineRule="auto"/>
+              <w:rPr>
+                <w:b/>
+                <w:sz w:val="28"/>
+                <w:szCs w:val="28"/>
+              </w:rPr>
+            </w:pPr>
+            <w:r>
+              <w:rPr>
+                <w:b/>
+                <w:sz w:val="28"/>
+                <w:szCs w:val="28"/>
+              </w:rPr>
+              <w:t xml:space="preserve">Dasini No.-  </w:t>
+            </w:r>
+            <w:r>
+              <w:rPr>
+                <w:b/>
+                <w:sz w:val="28"/>
+                <w:szCs w:val="28"/>
+              </w:rPr>
+              <w:t>3</w:t>
+            </w:r>
           </w:p>
         </w:tc>
         <w:tc>
@@ -1552,7 +1645,6 @@
           </w:tcPr>
           <w:p>
             <w:pPr>
-              <w:widowControl w:val="0"/>
               <w:autoSpaceDE w:val="0"/>
               <w:autoSpaceDN w:val="0"/>
               <w:adjustRightInd w:val="0"/>
@@ -1563,6 +1655,114 @@
                 <w:szCs w:val="40"/>
               </w:rPr>
             </w:pPr>
+            <w:r>
+              <w:rPr>
+                <w:rFonts w:ascii="BRH Malayalam Extra" w:hAnsi="BRH Malayalam Extra" w:cs="BRH Malayalam Extra"/>
+                <w:sz w:val="40"/>
+                <w:szCs w:val="40"/>
+              </w:rPr>
+              <w:t>Z</w:t>
+            </w:r>
+            <w:r>
+              <w:rPr>
+                <w:rFonts w:ascii="BRH Malayalam" w:hAnsi="BRH Malayalam" w:cs="BRH Malayalam"/>
+                <w:color w:val="000000"/>
+                <w:sz w:val="40"/>
+                <w:szCs w:val="40"/>
+              </w:rPr>
+              <w:t>¥</w:t>
+            </w:r>
+            <w:r>
+              <w:rPr>
+                <w:rFonts w:ascii="BRH Malayalam" w:hAnsi="BRH Malayalam" w:cs="BRH Malayalam"/>
+                <w:color w:val="000000"/>
+                <w:sz w:val="40"/>
+                <w:szCs w:val="40"/>
+                <w:highlight w:val="yellow"/>
+              </w:rPr>
+              <w:t>Ç</w:t>
+            </w:r>
+            <w:r>
+              <w:rPr>
+                <w:rFonts w:ascii="BRH Malayalam Extra" w:hAnsi="BRH Malayalam Extra" w:cs="BRH Malayalam Extra"/>
+                <w:sz w:val="40"/>
+                <w:szCs w:val="40"/>
+              </w:rPr>
+              <w:t>û</w:t>
+            </w:r>
+            <w:r>
+              <w:rPr>
+                <w:rFonts w:ascii="BRH Malayalam" w:hAnsi="BRH Malayalam" w:cs="BRH Malayalam"/>
+                <w:color w:val="000000"/>
+                <w:sz w:val="40"/>
+                <w:szCs w:val="40"/>
+              </w:rPr>
+              <w:t>x</w:t>
+            </w:r>
+            <w:r>
+              <w:rPr>
+                <w:rFonts w:ascii="BRH Malayalam Extra" w:hAnsi="BRH Malayalam Extra" w:cs="BRH Malayalam Extra"/>
+                <w:sz w:val="40"/>
+                <w:szCs w:val="40"/>
+              </w:rPr>
+              <w:t>e—b¥c Kxi</w:t>
+            </w:r>
+            <w:r>
+              <w:rPr>
+                <w:rFonts w:ascii="BRH Malayalam Extra" w:hAnsi="BRH Malayalam Extra" w:cs="BRH Malayalam Extra"/>
+                <w:b/>
+                <w:sz w:val="34"/>
+                <w:szCs w:val="40"/>
+              </w:rPr>
+              <w:t>–</w:t>
+            </w:r>
+            <w:r>
+              <w:rPr>
+                <w:rFonts w:ascii="BRH Malayalam Extra" w:hAnsi="BRH Malayalam Extra" w:cs="BRH Malayalam Extra"/>
+                <w:sz w:val="40"/>
+                <w:szCs w:val="40"/>
+              </w:rPr>
+              <w:t>b¡N</w:t>
+            </w:r>
+            <w:r>
+              <w:rPr>
+                <w:rFonts w:ascii="BRH Malayalam Extra" w:hAnsi="BRH Malayalam Extra" w:cs="BRH Malayalam Extra"/>
+                <w:b/>
+                <w:sz w:val="34"/>
+                <w:szCs w:val="40"/>
+              </w:rPr>
+              <w:t>–</w:t>
+            </w:r>
+            <w:r>
+              <w:rPr>
+                <w:rFonts w:ascii="BRH Malayalam Extra" w:hAnsi="BRH Malayalam Extra" w:cs="BRH Malayalam Extra"/>
+                <w:b/>
+                <w:sz w:val="34"/>
+                <w:szCs w:val="40"/>
+              </w:rPr>
+              <w:t>-</w:t>
+            </w:r>
+          </w:p>
+          <w:p>
+            <w:pPr>
+              <w:autoSpaceDE w:val="0"/>
+              <w:autoSpaceDN w:val="0"/>
+              <w:adjustRightInd w:val="0"/>
+              <w:spacing w:before="0" w:line="240" w:lineRule="auto"/>
+              <w:rPr>
+                <w:rFonts w:ascii="BRH Malayalam Extra" w:hAnsi="BRH Malayalam Extra" w:cs="BRH Malayalam Extra"/>
+                <w:sz w:val="40"/>
+                <w:szCs w:val="40"/>
+              </w:rPr>
+            </w:pPr>
+            <w:r>
+              <w:rPr>
+                <w:rFonts w:ascii="BRH Malayalam Extra" w:hAnsi="BRH Malayalam Extra" w:cs="BRH Malayalam Extra"/>
+                <w:sz w:val="40"/>
+                <w:szCs w:val="40"/>
+              </w:rPr>
+              <w:t>i±y—ZI |</w:t>
+            </w:r>
           </w:p>
         </w:tc>
         <w:tc>
@@ -1577,7 +1777,6 @@
           </w:tcPr>
           <w:p>
             <w:pPr>
-              <w:widowControl w:val="0"/>
               <w:autoSpaceDE w:val="0"/>
               <w:autoSpaceDN w:val="0"/>
               <w:adjustRightInd w:val="0"/>
@@ -1588,6 +1787,66 @@
                 <w:szCs w:val="40"/>
               </w:rPr>
             </w:pPr>
+            <w:r>
+              <w:rPr>
+                <w:rFonts w:ascii="BRH Malayalam Extra" w:hAnsi="BRH Malayalam Extra" w:cs="BRH Malayalam Extra"/>
+                <w:sz w:val="40"/>
+                <w:szCs w:val="40"/>
+              </w:rPr>
+              <w:t>Z</w:t>
+            </w:r>
+            <w:r>
+              <w:rPr>
+                <w:rFonts w:ascii="BRH Malayalam" w:hAnsi="BRH Malayalam" w:cs="BRH Malayalam"/>
+                <w:color w:val="000000"/>
+                <w:sz w:val="40"/>
+                <w:szCs w:val="40"/>
+                <w:highlight w:val="green"/>
+              </w:rPr>
+              <w:t>¥Àûx</w:t>
+            </w:r>
+            <w:r>
+              <w:rPr>
+                <w:rFonts w:ascii="BRH Malayalam Extra" w:hAnsi="BRH Malayalam Extra" w:cs="BRH Malayalam Extra"/>
+                <w:sz w:val="40"/>
+                <w:szCs w:val="40"/>
+              </w:rPr>
+              <w:t>e—b¥c Kxi</w:t>
+            </w:r>
+            <w:r>
+              <w:rPr>
+                <w:rFonts w:ascii="BRH Malayalam Extra" w:hAnsi="BRH Malayalam Extra" w:cs="BRH Malayalam Extra"/>
+                <w:b/>
+                <w:sz w:val="34"/>
+                <w:szCs w:val="40"/>
+              </w:rPr>
+              <w:t>–</w:t>
+            </w:r>
+            <w:r>
+              <w:rPr>
+                <w:rFonts w:ascii="BRH Malayalam Extra" w:hAnsi="BRH Malayalam Extra" w:cs="BRH Malayalam Extra"/>
+                <w:sz w:val="40"/>
+                <w:szCs w:val="40"/>
+              </w:rPr>
+              <w:t>b¡N</w:t>
+            </w:r>
+            <w:r>
+              <w:rPr>
+                <w:rFonts w:ascii="BRH Malayalam Extra" w:hAnsi="BRH Malayalam Extra" w:cs="BRH Malayalam Extra"/>
+                <w:b/>
+                <w:sz w:val="34"/>
+                <w:szCs w:val="40"/>
+              </w:rPr>
+              <w:t>–</w:t>
+            </w:r>
+            <w:r>
+              <w:rPr>
+                <w:rFonts w:ascii="BRH Malayalam Extra" w:hAnsi="BRH Malayalam Extra" w:cs="BRH Malayalam Extra"/>
+                <w:sz w:val="40"/>
+                <w:szCs w:val="40"/>
+              </w:rPr>
+              <w:t>-i±y—ZI |</w:t>
+            </w:r>
           </w:p>
         </w:tc>
       </w:tr>
@@ -1664,7 +1923,6 @@
           <w:szCs w:val="32"/>
           <w:u w:val="single"/>
         </w:rPr>
-        <w:lastRenderedPageBreak/>
         <w:t xml:space="preserve">TaittirIya BrAhmaNam - TB 3.7 to 3.12   </w:t>
       </w:r>
     </w:p>
@@ -5023,6 +5281,7 @@
                 <w:sz w:val="28"/>
                 <w:szCs w:val="28"/>
               </w:rPr>
+              <w:lastRenderedPageBreak/>
               <w:t>T.B.3.8.2.2</w:t>
             </w:r>
           </w:p>
@@ -5059,7 +5318,6 @@
                 <w:sz w:val="28"/>
                 <w:szCs w:val="28"/>
               </w:rPr>
-              <w:lastRenderedPageBreak/>
               <w:t>Dasini No.-  4</w:t>
             </w:r>
           </w:p>
@@ -5089,7 +5347,6 @@
                 <w:sz w:val="40"/>
                 <w:szCs w:val="40"/>
               </w:rPr>
-              <w:lastRenderedPageBreak/>
               <w:t>by</w:t>
             </w:r>
             <w:r>
@@ -7069,6 +7326,7 @@
                 <w:sz w:val="40"/>
                 <w:szCs w:val="40"/>
               </w:rPr>
+              <w:lastRenderedPageBreak/>
               <w:t>R¡</w:t>
             </w:r>
             <w:r>
@@ -7118,6 +7376,7 @@
                 <w:sz w:val="40"/>
                 <w:szCs w:val="40"/>
               </w:rPr>
+              <w:lastRenderedPageBreak/>
               <w:t>sûx¥tZõ—ph£</w:t>
             </w:r>
             <w:r>
@@ -7170,6 +7429,7 @@
                 <w:sz w:val="40"/>
                 <w:szCs w:val="40"/>
               </w:rPr>
+              <w:lastRenderedPageBreak/>
               <w:t>R¡</w:t>
             </w:r>
             <w:r>
@@ -8745,6 +9005,7 @@
                 <w:sz w:val="32"/>
                 <w:szCs w:val="32"/>
               </w:rPr>
+              <w:lastRenderedPageBreak/>
               <w:t>Reference</w:t>
             </w:r>
           </w:p>
@@ -8767,6 +9028,7 @@
                 <w:sz w:val="32"/>
                 <w:szCs w:val="32"/>
               </w:rPr>
+              <w:lastRenderedPageBreak/>
               <w:t>As Printed</w:t>
             </w:r>
           </w:p>
@@ -8808,6 +9070,7 @@
                 <w:sz w:val="32"/>
                 <w:szCs w:val="32"/>
               </w:rPr>
+              <w:lastRenderedPageBreak/>
               <w:t>(Comments and analysis)</w:t>
             </w:r>
           </w:p>

</xml_diff>